<commit_message>
Completa documentos de entrega 2
Co-authored-by: Copilot <223556219+Copilot@users.noreply.github.com>
</commit_message>
<xml_diff>
--- a/Sistema Experto de Cine.docx
+++ b/Sistema Experto de Cine.docx
@@ -4,7 +4,7 @@
   <w:body>
     <w:p>
       <w:pPr>
-        <w:pStyle w:val="Ttulo"/>
+        <w:pStyle w:val="Title"/>
         <w:jc w:val="center"/>
       </w:pPr>
       <w:bookmarkStart w:id="0" w:name="_xw2cd7x174ws" w:colFirst="0" w:colLast="0"/>
@@ -12,13 +12,13 @@
     </w:p>
     <w:p>
       <w:pPr>
-        <w:pStyle w:val="Ttulo"/>
+        <w:pStyle w:val="Title"/>
         <w:jc w:val="center"/>
       </w:pPr>
     </w:p>
     <w:p>
       <w:pPr>
-        <w:pStyle w:val="Ttulo"/>
+        <w:pStyle w:val="Title"/>
         <w:jc w:val="center"/>
       </w:pPr>
     </w:p>
@@ -624,12 +624,386 @@
     </w:p>
     <w:p>
       <w:pPr>
-        <w:spacing w:line="360" w:lineRule="auto"/>
-        <w:ind w:firstLine="720"/>
-        <w:rPr>
-          <w:lang w:val="es-CO"/>
-        </w:rPr>
-      </w:pPr>
+        <w:pStyle w:val="Heading2"/>
+        <w:rPr>
+          <w:sz w:val="24"/>
+          <w:szCs w:val="24"/>
+        </w:rPr>
+      </w:pPr>
+      <w:r>
+        <w:rPr>
+          <w:sz w:val="24"/>
+          <w:szCs w:val="24"/>
+        </w:rPr>
+        <w:t>1. Contexto y objetivo general</w:t>
+      </w:r>
+    </w:p>
+    <w:p>
+      <w:r>
+        <w:t xml:space="preserve">Este segundo entregable evoluciona el prototipo descrito en la propuesta inicial: acopla el motor lógico en Prolog con una aplicación interactiva en Python para que el usuario busque películas, consulte el resultado y audite el razonamiento que lo produjo. </w:t>
+      </w:r>
+    </w:p>
+    <w:p>
+      <w:r>
+        <w:t>El sistema adopta un enfoque de caja blanca. Cada recomendación conserva su justificación simbólica; las hipótesis que no prosperan incluyen el motivo del descarte, y los empates o coincidencias parciales generan una recomendación de evidencia adicional en lugar de un mensaje genérico de diagnóstico desconocido.</w:t>
+      </w:r>
+    </w:p>
+    <w:p>
+      <w:pPr>
+        <w:pStyle w:val="Heading2"/>
+        <w:rPr>
+          <w:sz w:val="24"/>
+          <w:szCs w:val="24"/>
+        </w:rPr>
+      </w:pPr>
+      <w:r>
+        <w:rPr>
+          <w:sz w:val="24"/>
+          <w:szCs w:val="24"/>
+        </w:rPr>
+        <w:t>2. División de roles y responsabilidades</w:t>
+      </w:r>
+    </w:p>
+    <w:p>
+      <w:r>
+        <w:t xml:space="preserve">• </w:t>
+      </w:r>
+      <w:r>
+        <w:t>David Reyes</w:t>
+      </w:r>
+      <w:r>
+        <w:t xml:space="preserve"> — Ingeniero del Conocimiento y Motor Simbólico: estructura en base_conocimiento.pl los predicados para recolectar la traza, identificar hipótesis descartadas y elegir el dato o síntoma adicional con mayor peso para confirmar o desempatar.</w:t>
+      </w:r>
+    </w:p>
+    <w:p>
+      <w:r>
+        <w:t xml:space="preserve">• </w:t>
+      </w:r>
+      <w:r>
+        <w:t>Juan Collazos</w:t>
+      </w:r>
+      <w:r>
+        <w:t xml:space="preserve"> — Ingeniero de Integración y Explicabilidad: construye el puente Python mediante PySwip, desarrolla la interfaz en main.py y presenta visualmente los módulos «¿Por qué?» y «¿Qué falta?».</w:t>
+      </w:r>
+    </w:p>
+    <w:p>
+      <w:r>
+        <w:t>La división identifica responsabilidades técnicas complementarias. La integración final mantiene la interfaz, el transporte de datos y la lógica simbólica separados para facilitar su mantenimiento y revisión.</w:t>
+      </w:r>
+    </w:p>
+    <w:p/>
+    <w:p/>
+    <w:p>
+      <w:pPr>
+        <w:pStyle w:val="Heading2"/>
+        <w:rPr>
+          <w:sz w:val="24"/>
+          <w:szCs w:val="24"/>
+        </w:rPr>
+      </w:pPr>
+      <w:r>
+        <w:rPr>
+          <w:sz w:val="24"/>
+          <w:szCs w:val="24"/>
+        </w:rPr>
+        <w:lastRenderedPageBreak/>
+        <w:t>3. Arquitectura híbrida y requisitos técnicos</w:t>
+      </w:r>
+    </w:p>
+    <w:p>
+      <w:r>
+        <w:t>• Capa de presentación (main.py, Streamlit): captura la búsqueda y los filtros, presenta los resultados y despliega la auditoría. No implementa reglas de selección ni calcula los puntajes del motor.</w:t>
+      </w:r>
+    </w:p>
+    <w:p>
+      <w:r>
+        <w:t>• Puente (motor.py, PySwip): valida y limpia las entradas, invoca predicados Prolog con argumentos instanciados y recibe la respuesta serializada para la interfaz.</w:t>
+      </w:r>
+    </w:p>
+    <w:p>
+      <w:r>
+        <w:t>• Capa simbólica (base_conocimiento.pl, SWI-Prolog): normaliza la consulta, aplica hechos y reglas, infiere y ordena hipótesis, construye la traza y calcula decisiones y recomendaciones.</w:t>
+      </w:r>
+    </w:p>
+    <w:p>
+      <w:r>
+        <w:t xml:space="preserve">El contrato principal del puente es buscar_json/3: recibe el texto de consulta y la edad (o -1 cuando no se aplica ese filtro) y devuelve una respuesta JSON con estado, criterios, resultados, decisión y auditoría. Python trata el texto como dato </w:t>
+      </w:r>
+      <w:r>
+        <w:t xml:space="preserve">y </w:t>
+      </w:r>
+      <w:r>
+        <w:t>valida tipos y rangos antes de consultar. La lógica del dominio permanece en Prolog.</w:t>
+      </w:r>
+    </w:p>
+    <w:p>
+      <w:r>
+        <w:t>No se utiliza read/1 en Prolog: la captura ocurre en la interfaz y el motor responde a consultas explícitas, sin bloquear el hilo de la aplicación. Así se conserva un flujo interactivo y se evita mezclar entrada/salida imperativa con inferencia simbólica.</w:t>
+      </w:r>
+    </w:p>
+    <w:p>
+      <w:pPr>
+        <w:pStyle w:val="Heading2"/>
+        <w:rPr>
+          <w:sz w:val="24"/>
+          <w:szCs w:val="24"/>
+        </w:rPr>
+      </w:pPr>
+      <w:r>
+        <w:rPr>
+          <w:sz w:val="24"/>
+          <w:szCs w:val="24"/>
+        </w:rPr>
+        <w:t xml:space="preserve">4. </w:t>
+      </w:r>
+      <w:proofErr w:type="spellStart"/>
+      <w:r>
+        <w:rPr>
+          <w:sz w:val="24"/>
+          <w:szCs w:val="24"/>
+        </w:rPr>
+        <w:t>Explicabilidad</w:t>
+      </w:r>
+      <w:proofErr w:type="spellEnd"/>
+      <w:r>
+        <w:rPr>
+          <w:sz w:val="24"/>
+          <w:szCs w:val="24"/>
+        </w:rPr>
+        <w:t>: ¿Por qué?</w:t>
+      </w:r>
+    </w:p>
+    <w:p>
+      <w:r>
+        <w:t>Para cada resultado, el panel de auditoría presenta la información que permite reconstruir y revisar la inferencia:</w:t>
+      </w:r>
+    </w:p>
+    <w:p>
+      <w:r>
+        <w:t>• Reglas disparadas: reglas intermedias y finales que sustentan la hipótesis principal, identificadas y descritas para lectura humana.</w:t>
+      </w:r>
+    </w:p>
+    <w:p>
+      <w:r>
+        <w:t>• Hechos verdaderos: datos del catálogo y evidencia de la consulta que fueron comprobados y unificados durante la inferencia, como el género, una etiqueta o un tema coincidente.</w:t>
+      </w:r>
+    </w:p>
+    <w:p>
+      <w:r>
+        <w:lastRenderedPageBreak/>
+        <w:t>• Hipótesis descartadas: alternativas que compartían parte de la evidencia, pero quedaron fuera por una condición excluyente, por el filtro de edad, por ausencia de evidencia suficiente o por obtener menor puntaje. Se presenta el motivo correspondiente.</w:t>
+      </w:r>
+    </w:p>
+    <w:p>
+      <w:r>
+        <w:t>La auditoría se construye desde Prolog y acompaña a la respuesta; no se infiere retrospectivamente mediante texto escrito en la interfaz. Esto permite contrastar el resultado con el conocimiento declarado y explicar tanto las coincidencias como las exclusiones.</w:t>
+      </w:r>
+    </w:p>
+    <w:p>
+      <w:pPr>
+        <w:pStyle w:val="Heading2"/>
+        <w:rPr>
+          <w:sz w:val="24"/>
+          <w:szCs w:val="24"/>
+        </w:rPr>
+      </w:pPr>
+      <w:r>
+        <w:rPr>
+          <w:sz w:val="24"/>
+          <w:szCs w:val="24"/>
+        </w:rPr>
+        <w:t>5. Recomendación: ¿Qué falta?</w:t>
+      </w:r>
+    </w:p>
+    <w:p>
+      <w:r>
+        <w:t>Cuando varias hipótesis quedan empatadas en primer lugar o la evidencia solo respalda una coincidencia parcial, el motor informa que aún no hay una decisión definitiva. Prolog evalúa qué criterios todavía no se han consultado, cuáles separan a las hipótesis líderes y qué prioridad tienen; con esa evaluación formula la pregunta adicional más útil.</w:t>
+      </w:r>
+    </w:p>
+    <w:p>
+      <w:r>
+        <w:t>La interfaz comunica claramente el dato o preferencia solicitado y las hipótesis que compiten. Por ejemplo, ante varias películas divertidas con el mismo puntaje, puede preguntar si el usuario necesita una opción apta para público infantil. La respuesta a esa pregunta permite confirmar o separar candidatas, en vez de limitarse a</w:t>
+      </w:r>
+      <w:r>
+        <w:t xml:space="preserve"> </w:t>
+      </w:r>
+      <w:r>
+        <w:t>diagnóstico desconocido.</w:t>
+      </w:r>
+    </w:p>
+    <w:p>
+      <w:pPr>
+        <w:pStyle w:val="Heading2"/>
+        <w:rPr>
+          <w:sz w:val="24"/>
+          <w:szCs w:val="24"/>
+        </w:rPr>
+      </w:pPr>
+      <w:r>
+        <w:rPr>
+          <w:sz w:val="24"/>
+          <w:szCs w:val="24"/>
+        </w:rPr>
+        <w:t>6. Escenarios de demostración y validación</w:t>
+      </w:r>
+    </w:p>
+    <w:p>
+      <w:r>
+        <w:t xml:space="preserve">• Decisión definitiva y trazable: la búsqueda películas de romance propone </w:t>
+      </w:r>
+      <w:proofErr w:type="spellStart"/>
+      <w:r>
+        <w:t>Titanic</w:t>
+      </w:r>
+      <w:proofErr w:type="spellEnd"/>
+      <w:r>
+        <w:t xml:space="preserve"> como hipótesis única y permite revisar las reglas activadas y los hechos verdaderos.</w:t>
+      </w:r>
+    </w:p>
+    <w:p>
+      <w:r>
+        <w:t xml:space="preserve">• Evidencia insuficiente y desempate: la búsqueda </w:t>
+      </w:r>
+      <w:r>
+        <w:t>p</w:t>
+      </w:r>
+      <w:r>
+        <w:t>elículas divertidas</w:t>
+      </w:r>
+      <w:r>
+        <w:t xml:space="preserve"> </w:t>
+      </w:r>
+      <w:r>
+        <w:t>produce varias hipótesis líderes; el sistema declara el empate y solicita un criterio adicional, como la aptitud para público infantil.</w:t>
+      </w:r>
+    </w:p>
+    <w:p>
+      <w:r>
+        <w:t>• Condición excluyente: en la búsqueda infantil, el motor aplica las restricciones declaradas y muestra en la auditoría por qué una hipótesis incompatible fue descartada.</w:t>
+      </w:r>
+    </w:p>
+    <w:p>
+      <w:r>
+        <w:lastRenderedPageBreak/>
+        <w:t>• Validación del puente: las pruebas automatizadas cubren consultas vacías o desconocidas, filtros de edad, normalización, deduplicación, entrada segura, explicaciones, desempates y otros flujos de integración.</w:t>
+      </w:r>
+    </w:p>
+    <w:p>
+      <w:pPr>
+        <w:pStyle w:val="Heading2"/>
+        <w:rPr>
+          <w:sz w:val="24"/>
+          <w:szCs w:val="24"/>
+        </w:rPr>
+      </w:pPr>
+      <w:r>
+        <w:rPr>
+          <w:sz w:val="24"/>
+          <w:szCs w:val="24"/>
+        </w:rPr>
+        <w:t>7. Artefactos del segundo entregable</w:t>
+      </w:r>
+    </w:p>
+    <w:p>
+      <w:r>
+        <w:t>• main.py: interfaz web interactiva desarrollada con Streamlit.</w:t>
+      </w:r>
+    </w:p>
+    <w:p>
+      <w:r>
+        <w:t>• base_conocimiento.pl: catálogo, reglas de inferencia, trazabilidad y recomendación de evidencia adicional.</w:t>
+      </w:r>
+    </w:p>
+    <w:p>
+      <w:r>
+        <w:t>• README.md: requisitos, instalación, ejecución y casos sugeridos para demostrar la aplicación.</w:t>
+      </w:r>
+    </w:p>
+    <w:p>
+      <w:r>
+        <w:t>• DICCIONARIO_PREDICADOS.md: documentación técnica de predicados y sus modos de uso.</w:t>
+      </w:r>
+    </w:p>
+    <w:p>
+      <w:r>
+        <w:t>• motor.py: puente PySwip que valida entradas y transporta la solicitud y respuesta entre Python y Prolog.</w:t>
+      </w:r>
+    </w:p>
+    <w:p>
+      <w:r>
+        <w:t>• pruebas.py y requirements.txt: pruebas reproducibles y dependencias del proyecto.</w:t>
+      </w:r>
+    </w:p>
+    <w:p>
+      <w:pPr>
+        <w:pStyle w:val="Heading2"/>
+        <w:rPr>
+          <w:sz w:val="24"/>
+          <w:szCs w:val="24"/>
+        </w:rPr>
+      </w:pPr>
+      <w:r>
+        <w:rPr>
+          <w:sz w:val="24"/>
+          <w:szCs w:val="24"/>
+        </w:rPr>
+        <w:t>8. Actualización del diccionario de predicados</w:t>
+      </w:r>
+    </w:p>
+    <w:p>
+      <w:r>
+        <w:t>El diccionario técnico documenta el nombre y aridad, los argumentos de entrada (+), salida (-) o uso bidireccional (?), y la función de los predicados nuevos. Entre los predicados centrales se encuentran:</w:t>
+      </w:r>
+    </w:p>
+    <w:p>
+      <w:r>
+        <w:t>• reglas_disparadas/3 y hechos_verdaderos/4: reconstruyen las reglas activadas y los hechos comprobados para una hipótesis.</w:t>
+      </w:r>
+    </w:p>
+    <w:p>
+      <w:r>
+        <w:t>• hipotesis_descartadas/5 y auditoria_motor/5: explican las alternativas descartadas y agrupan la información de auditoría.</w:t>
+      </w:r>
+    </w:p>
+    <w:p>
+      <w:r>
+        <w:lastRenderedPageBreak/>
+        <w:t>• recomendacion_desempate/3, recomendacion_confirmacion/3 y decision_motor/4: evalúan la evidencia insuficiente, proponen una pregunta discriminante y determinan el estado de la decisión.</w:t>
+      </w:r>
+    </w:p>
+    <w:p>
+      <w:r>
+        <w:t>• buscar_json/3: expone a la aplicación la búsqueda, el dictamen, la recomendación y la auditoría en un contrato JSON.</w:t>
+      </w:r>
+    </w:p>
+    <w:p>
+      <w:pPr>
+        <w:pStyle w:val="Heading2"/>
+        <w:rPr>
+          <w:sz w:val="24"/>
+          <w:szCs w:val="24"/>
+        </w:rPr>
+      </w:pPr>
+      <w:r>
+        <w:rPr>
+          <w:sz w:val="24"/>
+          <w:szCs w:val="24"/>
+        </w:rPr>
+        <w:t>9. Consideraciones y cierre</w:t>
+      </w:r>
+    </w:p>
+    <w:p>
+      <w:r>
+        <w:t>La idea</w:t>
+      </w:r>
+      <w:r>
+        <w:t xml:space="preserve"> ofrece una experiencia interactiva y conserva la separación entre presentación, integración e inferencia. La explicación y la recomendación de evidencia proceden del motor lógico, de modo que el usuario puede inspeccionar el fundamento de una propuesta y saber qué información falta para resolver una ambigüedad.</w:t>
+      </w:r>
+    </w:p>
+    <w:p>
+      <w:r>
+        <w:t>El catálogo y las etiquetas son didácticos y locales; las edades incluidas no sustituyen clasificaciones oficiales. Las opiniones de ejemplo se utilizan para demostrar reglas y no representan evaluaciones verificadas de fuentes externas.</w:t>
+      </w:r>
     </w:p>
     <w:sectPr>
       <w:pgSz w:w="11909" w:h="16834"/>
@@ -1654,7 +2028,7 @@
     <w:name w:val="Normal"/>
     <w:qFormat/>
   </w:style>
-  <w:style w:type="paragraph" w:styleId="Ttulo1">
+  <w:style w:type="paragraph" w:styleId="Heading1">
     <w:name w:val="heading 1"/>
     <w:basedOn w:val="Normal"/>
     <w:next w:val="Normal"/>
@@ -1672,12 +2046,11 @@
       <w:color w:val="111111"/>
     </w:rPr>
   </w:style>
-  <w:style w:type="paragraph" w:styleId="Ttulo2">
+  <w:style w:type="paragraph" w:styleId="Heading2">
     <w:name w:val="heading 2"/>
     <w:basedOn w:val="Normal"/>
     <w:next w:val="Normal"/>
     <w:uiPriority w:val="9"/>
-    <w:semiHidden/>
     <w:unhideWhenUsed/>
     <w:qFormat/>
     <w:pPr>
@@ -1693,7 +2066,7 @@
       <w:szCs w:val="36"/>
     </w:rPr>
   </w:style>
-  <w:style w:type="paragraph" w:styleId="Ttulo3">
+  <w:style w:type="paragraph" w:styleId="Heading3">
     <w:name w:val="heading 3"/>
     <w:basedOn w:val="Normal"/>
     <w:next w:val="Normal"/>
@@ -1714,7 +2087,7 @@
       <w:szCs w:val="28"/>
     </w:rPr>
   </w:style>
-  <w:style w:type="paragraph" w:styleId="Ttulo4">
+  <w:style w:type="paragraph" w:styleId="Heading4">
     <w:name w:val="heading 4"/>
     <w:basedOn w:val="Normal"/>
     <w:next w:val="Normal"/>
@@ -1733,7 +2106,7 @@
       <w:bCs/>
     </w:rPr>
   </w:style>
-  <w:style w:type="paragraph" w:styleId="Ttulo5">
+  <w:style w:type="paragraph" w:styleId="Heading5">
     <w:name w:val="heading 5"/>
     <w:basedOn w:val="Normal"/>
     <w:next w:val="Normal"/>
@@ -1754,7 +2127,7 @@
       <w:szCs w:val="22"/>
     </w:rPr>
   </w:style>
-  <w:style w:type="paragraph" w:styleId="Ttulo6">
+  <w:style w:type="paragraph" w:styleId="Heading6">
     <w:name w:val="heading 6"/>
     <w:basedOn w:val="Normal"/>
     <w:next w:val="Normal"/>
@@ -1775,12 +2148,13 @@
       <w:szCs w:val="20"/>
     </w:rPr>
   </w:style>
-  <w:style w:type="character" w:default="1" w:styleId="Fuentedeprrafopredeter">
+  <w:style w:type="character" w:default="1" w:styleId="DefaultParagraphFont">
     <w:name w:val="Default Paragraph Font"/>
     <w:uiPriority w:val="1"/>
+    <w:semiHidden/>
     <w:unhideWhenUsed/>
   </w:style>
-  <w:style w:type="table" w:default="1" w:styleId="Tablanormal">
+  <w:style w:type="table" w:default="1" w:styleId="TableNormal">
     <w:name w:val="Normal Table"/>
     <w:uiPriority w:val="99"/>
     <w:semiHidden/>
@@ -1795,13 +2169,13 @@
       </w:tblCellMar>
     </w:tblPr>
   </w:style>
-  <w:style w:type="numbering" w:default="1" w:styleId="Sinlista">
+  <w:style w:type="numbering" w:default="1" w:styleId="NoList">
     <w:name w:val="No List"/>
     <w:uiPriority w:val="99"/>
     <w:semiHidden/>
     <w:unhideWhenUsed/>
   </w:style>
-  <w:style w:type="table" w:customStyle="1" w:styleId="TableNormal">
+  <w:style w:type="table" w:customStyle="1" w:styleId="TableNormal0">
     <w:name w:val="TableNormal"/>
     <w:tblPr>
       <w:tblCellMar>
@@ -1812,7 +2186,7 @@
       </w:tblCellMar>
     </w:tblPr>
   </w:style>
-  <w:style w:type="paragraph" w:styleId="Ttulo">
+  <w:style w:type="paragraph" w:styleId="Title">
     <w:name w:val="Title"/>
     <w:basedOn w:val="Normal"/>
     <w:next w:val="Normal"/>
@@ -1829,7 +2203,7 @@
       <w:color w:val="111111"/>
     </w:rPr>
   </w:style>
-  <w:style w:type="paragraph" w:styleId="Subttulo">
+  <w:style w:type="paragraph" w:styleId="Subtitle">
     <w:name w:val="Subtitle"/>
     <w:basedOn w:val="Normal"/>
     <w:next w:val="Normal"/>

</xml_diff>